<commit_message>
Updated expo go build so that it builds
</commit_message>
<xml_diff>
--- a/Resources/REACT_Mobile_App_Gaps.docx
+++ b/Resources/REACT_Mobile_App_Gaps.docx
@@ -11,6 +11,7 @@
       </w:r>
     </w:p>
     <w:p>
+      <w:pPr/>
       <w:r>
         <w:rPr>
           <w:b/>
@@ -70,7 +71,9 @@
         <w:t xml:space="preserve"> post-PR #25.</w:t>
       </w:r>
     </w:p>
-    <w:p/>
+    <w:p>
+      <w:pPr/>
+    </w:p>
     <w:p>
       <w:pPr>
         <w:pStyle w:val="Heading1"/>
@@ -138,7 +141,7 @@
         <w:rPr>
           <w:b/>
         </w:rPr>
-        <w:t>does not build.</w:t>
+        <w:t>builds.</w:t>
       </w:r>
       <w:r>
         <w:t xml:space="preserve"> </w:t>
@@ -148,103 +151,21 @@
           <w:rFonts w:ascii="Consolas" w:hAnsi="Consolas"/>
           <w:sz w:val="20"/>
         </w:rPr>
-        <w:t>npx expo export</w:t>
+        <w:t>npx expo export --platform ios</w:t>
       </w:r>
       <w:r>
-        <w:t xml:space="preserve"> fails immediately — </w:t>
-      </w:r>
-      <w:r>
-        <w:rPr>
-          <w:rFonts w:ascii="Consolas" w:hAnsi="Consolas"/>
-          <w:sz w:val="20"/>
-        </w:rPr>
-        <w:t>Cannot find module 'babel-preset-expo'</w:t>
-      </w:r>
-      <w:r>
-        <w:t>. Nothing else about the mobile app can be verified end-to-end until this is fixed.</w:t>
+        <w:t xml:space="preserve"> bundles cleanly (667 modules). Fixed 2026-07-31 — see "Confirmed not gaps" below.</w:t>
       </w:r>
     </w:p>
-    <w:p/>
+    <w:p>
+      <w:pPr/>
+    </w:p>
     <w:p>
       <w:pPr>
         <w:pStyle w:val="Heading1"/>
       </w:pPr>
       <w:r>
         <w:t>Current gaps, in priority order</w:t>
-      </w:r>
-    </w:p>
-    <w:p>
-      <w:pPr>
-        <w:pStyle w:val="ListNumber"/>
-      </w:pPr>
-      <w:r>
-        <w:rPr>
-          <w:b/>
-        </w:rPr>
-        <w:t>App doesn't build — `babel-preset-expo` missing.</w:t>
-      </w:r>
-      <w:r>
-        <w:t xml:space="preserve"> </w:t>
-      </w:r>
-      <w:r>
-        <w:rPr>
-          <w:rFonts w:ascii="Consolas" w:hAnsi="Consolas"/>
-          <w:sz w:val="20"/>
-        </w:rPr>
-        <w:t>mobile/babel.config.js</w:t>
-      </w:r>
-      <w:r>
-        <w:t xml:space="preserve"> requires it; </w:t>
-      </w:r>
-      <w:r>
-        <w:rPr>
-          <w:rFonts w:ascii="Consolas" w:hAnsi="Consolas"/>
-          <w:sz w:val="20"/>
-        </w:rPr>
-        <w:t>mobile/package.json</w:t>
-      </w:r>
-      <w:r>
-        <w:t xml:space="preserve"> </w:t>
-      </w:r>
-      <w:r>
-        <w:rPr>
-          <w:rFonts w:ascii="Consolas" w:hAnsi="Consolas"/>
-          <w:sz w:val="20"/>
-        </w:rPr>
-        <w:t>devDependencies</w:t>
-      </w:r>
-      <w:r>
-        <w:t xml:space="preserve"> only lists </w:t>
-      </w:r>
-      <w:r>
-        <w:rPr>
-          <w:rFonts w:ascii="Consolas" w:hAnsi="Consolas"/>
-          <w:sz w:val="20"/>
-        </w:rPr>
-        <w:t>@types/react</w:t>
-      </w:r>
-      <w:r>
-        <w:t xml:space="preserve"> and </w:t>
-      </w:r>
-      <w:r>
-        <w:rPr>
-          <w:rFonts w:ascii="Consolas" w:hAnsi="Consolas"/>
-          <w:sz w:val="20"/>
-        </w:rPr>
-        <w:t>typescript</w:t>
-      </w:r>
-      <w:r>
-        <w:t xml:space="preserve">. Fix: </w:t>
-      </w:r>
-      <w:r>
-        <w:rPr>
-          <w:rFonts w:ascii="Consolas" w:hAnsi="Consolas"/>
-          <w:sz w:val="20"/>
-        </w:rPr>
-        <w:t>npm install --save-dev babel-preset-expo</w:t>
-      </w:r>
-      <w:r>
-        <w:t>.</w:t>
       </w:r>
     </w:p>
     <w:p>
@@ -857,7 +778,9 @@
         <w:t>`.env` doesn't document `DASHBOARD_API_KEY` / `JITAI_RANDOMIZATION_PROBABILITY`.</w:t>
       </w:r>
     </w:p>
-    <w:p/>
+    <w:p>
+      <w:pPr/>
+    </w:p>
     <w:p>
       <w:pPr>
         <w:pStyle w:val="Heading1"/>
@@ -939,6 +862,94 @@
       </w:r>
       <w:r>
         <w:t>.</w:t>
+      </w:r>
+    </w:p>
+    <w:p>
+      <w:pPr>
+        <w:pStyle w:val="ListBullet"/>
+      </w:pPr>
+      <w:r>
+        <w:t xml:space="preserve">App build failure: fixed 2026-07-31 — </w:t>
+      </w:r>
+      <w:r>
+        <w:rPr>
+          <w:rFonts w:ascii="Consolas" w:hAnsi="Consolas"/>
+          <w:sz w:val="20"/>
+        </w:rPr>
+        <w:t>babel-preset-expo</w:t>
+      </w:r>
+      <w:r>
+        <w:t xml:space="preserve"> was only present as a nested dependency of </w:t>
+      </w:r>
+      <w:r>
+        <w:rPr>
+          <w:rFonts w:ascii="Consolas" w:hAnsi="Consolas"/>
+          <w:sz w:val="20"/>
+        </w:rPr>
+        <w:t>expo</w:t>
+      </w:r>
+      <w:r>
+        <w:t xml:space="preserve"> (</w:t>
+      </w:r>
+      <w:r>
+        <w:rPr>
+          <w:rFonts w:ascii="Consolas" w:hAnsi="Consolas"/>
+          <w:sz w:val="20"/>
+        </w:rPr>
+        <w:t>node_modules/expo/node_modules/babel-preset-expo</w:t>
+      </w:r>
+      <w:r>
+        <w:t xml:space="preserve">), unreachable from </w:t>
+      </w:r>
+      <w:r>
+        <w:rPr>
+          <w:rFonts w:ascii="Consolas" w:hAnsi="Consolas"/>
+          <w:sz w:val="20"/>
+        </w:rPr>
+        <w:t>mobile/babel.config.js</w:t>
+      </w:r>
+      <w:r>
+        <w:t xml:space="preserve">'s </w:t>
+      </w:r>
+      <w:r>
+        <w:rPr>
+          <w:rFonts w:ascii="Consolas" w:hAnsi="Consolas"/>
+          <w:sz w:val="20"/>
+        </w:rPr>
+        <w:t>require('babel-preset-expo')</w:t>
+      </w:r>
+      <w:r>
+        <w:t xml:space="preserve">. Added </w:t>
+      </w:r>
+      <w:r>
+        <w:rPr>
+          <w:rFonts w:ascii="Consolas" w:hAnsi="Consolas"/>
+          <w:sz w:val="20"/>
+        </w:rPr>
+        <w:t>"babel-preset-expo": "~56.0.15"</w:t>
+      </w:r>
+      <w:r>
+        <w:t xml:space="preserve"> to </w:t>
+      </w:r>
+      <w:r>
+        <w:rPr>
+          <w:rFonts w:ascii="Consolas" w:hAnsi="Consolas"/>
+          <w:sz w:val="20"/>
+        </w:rPr>
+        <w:t>mobile/package.json</w:t>
+      </w:r>
+      <w:r>
+        <w:t xml:space="preserve"> devDependencies and reinstalled; </w:t>
+      </w:r>
+      <w:r>
+        <w:rPr>
+          <w:rFonts w:ascii="Consolas" w:hAnsi="Consolas"/>
+          <w:sz w:val="20"/>
+        </w:rPr>
+        <w:t>npx expo export --platform ios</w:t>
+      </w:r>
+      <w:r>
+        <w:t xml:space="preserve"> now bundles cleanly (667 modules).</w:t>
       </w:r>
     </w:p>
     <w:sectPr>

</xml_diff>

<commit_message>
Add missing prompt-content gap: pushes never show real message text
The backend sends only {type, prompt_id, jitai_log_id} in the push data
payload by design (silent push), but the mobile app has no local prompt
catalog mapping prompt_id to real message text -- every push falls back
to the generic "Notification" toast. This was the original design intent
per the old TODO.md and was never built. Renumbered the gap list to put
this at #2, right after EMA submission, since it undermines the JITAI
intervention even when delivery and receipts work perfectly.
</commit_message>
<xml_diff>
--- a/Resources/REACT_Mobile_App_Gaps.docx
+++ b/Resources/REACT_Mobile_App_Gaps.docx
@@ -11,7 +11,6 @@
       </w:r>
     </w:p>
     <w:p>
-      <w:pPr/>
       <w:r>
         <w:rPr>
           <w:b/>
@@ -71,9 +70,7 @@
         <w:t xml:space="preserve"> post-PR #25.</w:t>
       </w:r>
     </w:p>
-    <w:p>
-      <w:pPr/>
-    </w:p>
+    <w:p/>
     <w:p>
       <w:pPr>
         <w:pStyle w:val="Heading1"/>
@@ -157,9 +154,7 @@
         <w:t xml:space="preserve"> bundles cleanly (667 modules). Fixed 2026-07-31 — see "Confirmed not gaps" below.</w:t>
       </w:r>
     </w:p>
-    <w:p>
-      <w:pPr/>
-    </w:p>
+    <w:p/>
     <w:p>
       <w:pPr>
         <w:pStyle w:val="Heading1"/>
@@ -210,6 +205,169 @@
       </w:r>
       <w:r>
         <w:t xml:space="preserve"> and never called. No mood/stress/energy input UI exists. No real EMA data can reach the decision engine without this. Assigned to Shawnick as his first task.</w:t>
+      </w:r>
+    </w:p>
+    <w:p>
+      <w:pPr>
+        <w:pStyle w:val="ListNumber"/>
+      </w:pPr>
+      <w:r>
+        <w:rPr>
+          <w:b/>
+        </w:rPr>
+        <w:t>Pushes never show real prompt content — no prompt library on the mobile side.</w:t>
+      </w:r>
+      <w:r>
+        <w:t xml:space="preserve"> </w:t>
+      </w:r>
+      <w:r>
+        <w:rPr>
+          <w:rFonts w:ascii="Consolas" w:hAnsi="Consolas"/>
+          <w:sz w:val="20"/>
+        </w:rPr>
+        <w:t>notification_service.py</w:t>
+      </w:r>
+      <w:r>
+        <w:t xml:space="preserve">'s </w:t>
+      </w:r>
+      <w:r>
+        <w:rPr>
+          <w:rFonts w:ascii="Consolas" w:hAnsi="Consolas"/>
+          <w:sz w:val="20"/>
+        </w:rPr>
+        <w:t>build_jitai_push_message()</w:t>
+      </w:r>
+      <w:r>
+        <w:t xml:space="preserve"> sends only </w:t>
+      </w:r>
+      <w:r>
+        <w:rPr>
+          <w:rFonts w:ascii="Consolas" w:hAnsi="Consolas"/>
+          <w:sz w:val="20"/>
+        </w:rPr>
+        <w:t>data: {type, prompt_id, jitai_log_id}</w:t>
+      </w:r>
+      <w:r>
+        <w:t xml:space="preserve"> — no </w:t>
+      </w:r>
+      <w:r>
+        <w:rPr>
+          <w:rFonts w:ascii="Consolas" w:hAnsi="Consolas"/>
+          <w:sz w:val="20"/>
+        </w:rPr>
+        <w:t>title</w:t>
+      </w:r>
+      <w:r>
+        <w:t xml:space="preserve">, no </w:t>
+      </w:r>
+      <w:r>
+        <w:rPr>
+          <w:rFonts w:ascii="Consolas" w:hAnsi="Consolas"/>
+          <w:sz w:val="20"/>
+        </w:rPr>
+        <w:t>body</w:t>
+      </w:r>
+      <w:r>
+        <w:t xml:space="preserve">, ever (intentional, per this project's silent-push design). </w:t>
+      </w:r>
+      <w:r>
+        <w:rPr>
+          <w:rFonts w:ascii="Consolas" w:hAnsi="Consolas"/>
+          <w:sz w:val="20"/>
+        </w:rPr>
+        <w:t>mobile/App.tsx</w:t>
+      </w:r>
+      <w:r>
+        <w:t xml:space="preserve">'s foreground handler does </w:t>
+      </w:r>
+      <w:r>
+        <w:rPr>
+          <w:rFonts w:ascii="Consolas" w:hAnsi="Consolas"/>
+          <w:sz w:val="20"/>
+        </w:rPr>
+        <w:t>notification.request.content.title ?? 'Notification'</w:t>
+      </w:r>
+      <w:r>
+        <w:t xml:space="preserve"> / </w:t>
+      </w:r>
+      <w:r>
+        <w:rPr>
+          <w:rFonts w:ascii="Consolas" w:hAnsi="Consolas"/>
+          <w:sz w:val="20"/>
+        </w:rPr>
+        <w:t>body ?? ''</w:t>
+      </w:r>
+      <w:r>
+        <w:t xml:space="preserve"> — since those are always absent, </w:t>
+      </w:r>
+      <w:r>
+        <w:rPr>
+          <w:b/>
+        </w:rPr>
+        <w:t>every push shows the generic toast "📩 Notification" with no real content.</w:t>
+      </w:r>
+      <w:r>
+        <w:t xml:space="preserve"> There is no local prompt catalog anywhere in </w:t>
+      </w:r>
+      <w:r>
+        <w:rPr>
+          <w:rFonts w:ascii="Consolas" w:hAnsi="Consolas"/>
+          <w:sz w:val="20"/>
+        </w:rPr>
+        <w:t>mobile/src</w:t>
+      </w:r>
+      <w:r>
+        <w:t xml:space="preserve"> that maps </w:t>
+      </w:r>
+      <w:r>
+        <w:rPr>
+          <w:rFonts w:ascii="Consolas" w:hAnsi="Consolas"/>
+          <w:sz w:val="20"/>
+        </w:rPr>
+        <w:t>prompt_id</w:t>
+      </w:r>
+      <w:r>
+        <w:t xml:space="preserve"> → actual message text (checked — the only </w:t>
+      </w:r>
+      <w:r>
+        <w:rPr>
+          <w:rFonts w:ascii="Consolas" w:hAnsi="Consolas"/>
+          <w:sz w:val="20"/>
+        </w:rPr>
+        <w:t>prompt_id</w:t>
+      </w:r>
+      <w:r>
+        <w:t xml:space="preserve"> reference is a pass-through field in </w:t>
+      </w:r>
+      <w:r>
+        <w:rPr>
+          <w:rFonts w:ascii="Consolas" w:hAnsi="Consolas"/>
+          <w:sz w:val="20"/>
+        </w:rPr>
+        <w:t>endpoints.ts</w:t>
+      </w:r>
+      <w:r>
+        <w:t xml:space="preserve">). This was the original design intent (old </w:t>
+      </w:r>
+      <w:r>
+        <w:rPr>
+          <w:rFonts w:ascii="Consolas" w:hAnsi="Consolas"/>
+          <w:sz w:val="20"/>
+        </w:rPr>
+        <w:t>TODO.md</w:t>
+      </w:r>
+      <w:r>
+        <w:t xml:space="preserve">: "the React Native app holds the message text locally and displays it by </w:t>
+      </w:r>
+      <w:r>
+        <w:rPr>
+          <w:rFonts w:ascii="Consolas" w:hAnsi="Consolas"/>
+          <w:sz w:val="20"/>
+        </w:rPr>
+        <w:t>prompt_id</w:t>
+      </w:r>
+      <w:r>
+        <w:t>") and was never built. Even with EMA submission, auth, and delivery all fixed, a participant who gets a push currently sees nothing meaningful.</w:t>
       </w:r>
     </w:p>
     <w:p>
@@ -778,9 +936,7 @@
         <w:t>`.env` doesn't document `DASHBOARD_API_KEY` / `JITAI_RANDOMIZATION_PROBABILITY`.</w:t>
       </w:r>
     </w:p>
-    <w:p>
-      <w:pPr/>
-    </w:p>
+    <w:p/>
     <w:p>
       <w:pPr>
         <w:pStyle w:val="Heading1"/>
@@ -841,7 +997,7 @@
         <w:pStyle w:val="ListBullet"/>
       </w:pPr>
       <w:r>
-        <w:t>Multi-prompt support: resolved — CSV catalog (</w:t>
+        <w:t>Multi-prompt support (backend selection): resolved — CSV catalog (</w:t>
       </w:r>
       <w:r>
         <w:rPr>
@@ -861,7 +1017,36 @@
         <w:t>notification_service.py</w:t>
       </w:r>
       <w:r>
-        <w:t>.</w:t>
+        <w:t xml:space="preserve">, </w:t>
+      </w:r>
+      <w:r>
+        <w:rPr>
+          <w:rFonts w:ascii="Consolas" w:hAnsi="Consolas"/>
+          <w:sz w:val="20"/>
+        </w:rPr>
+        <w:t>select_prompt()</w:t>
+      </w:r>
+      <w:r>
+        <w:t xml:space="preserve"> draws from the EMA-eligible pool correctly. </w:t>
+      </w:r>
+      <w:r>
+        <w:rPr>
+          <w:b/>
+        </w:rPr>
+        <w:t>Not the same as gap #2 above</w:t>
+      </w:r>
+      <w:r>
+        <w:t xml:space="preserve"> — the backend picks a real </w:t>
+      </w:r>
+      <w:r>
+        <w:rPr>
+          <w:rFonts w:ascii="Consolas" w:hAnsi="Consolas"/>
+          <w:sz w:val="20"/>
+        </w:rPr>
+        <w:t>prompt_id</w:t>
+      </w:r>
+      <w:r>
+        <w:t>, it just never reaches the participant as visible text on the mobile side.</w:t>
       </w:r>
     </w:p>
     <w:p>

</xml_diff>